<commit_message>
Embed workflow diagram in User Guide (DOCX + PDF)
Inserted the RAAF_Workflow_Diagram.png after Section 1 (What Is RAAF?)
as a full-width Figure 1 with caption. PDF regenerated from updated DOCX
(119 KB -> 399 KB, confirming image is embedded).

Co-Authored-By: Claude Sonnet 4.6 <noreply@anthropic.com>
</commit_message>
<xml_diff>
--- a/docs/RAAF_User_Guide.docx
+++ b/docs/RAAF_User_Guide.docx
@@ -485,6 +485,75 @@
           <w:sz w:val="22"/>
         </w:rPr>
         <w:t>Keeps a searchable repository of every candidate you have ever assessed, so past talent is never wasted</w:t>
+      </w:r>
+    </w:p>
+    <w:p>
+      <w:pPr>
+        <w:spacing w:before="200" w:after="80"/>
+      </w:pPr>
+      <w:r>
+        <w:rPr>
+          <w:rFonts w:ascii="Arial" w:hAnsi="Arial"/>
+          <w:b/>
+          <w:color w:val="186FAF"/>
+          <w:sz w:val="22"/>
+        </w:rPr>
+        <w:t>Workflow Overview</w:t>
+      </w:r>
+    </w:p>
+    <w:p>
+      <w:pPr>
+        <w:spacing w:before="80" w:after="40"/>
+        <w:jc w:val="center"/>
+      </w:pPr>
+      <w:r>
+        <w:drawing>
+          <wp:inline xmlns:a="http://schemas.openxmlformats.org/drawingml/2006/main" xmlns:pic="http://schemas.openxmlformats.org/drawingml/2006/picture">
+            <wp:extent cx="5852160" cy="4168662"/>
+            <wp:docPr id="1" name="Picture 1"/>
+            <wp:cNvGraphicFramePr>
+              <a:graphicFrameLocks noChangeAspect="1"/>
+            </wp:cNvGraphicFramePr>
+            <a:graphic>
+              <a:graphicData uri="http://schemas.openxmlformats.org/drawingml/2006/picture">
+                <pic:pic>
+                  <pic:nvPicPr>
+                    <pic:cNvPr id="0" name="RAAF_Workflow_Diagram.png"/>
+                    <pic:cNvPicPr/>
+                  </pic:nvPicPr>
+                  <pic:blipFill>
+                    <a:blip r:embed="rId9"/>
+                    <a:stretch>
+                      <a:fillRect/>
+                    </a:stretch>
+                  </pic:blipFill>
+                  <pic:spPr>
+                    <a:xfrm>
+                      <a:off x="0" y="0"/>
+                      <a:ext cx="5852160" cy="4168662"/>
+                    </a:xfrm>
+                    <a:prstGeom prst="rect"/>
+                  </pic:spPr>
+                </pic:pic>
+              </a:graphicData>
+            </a:graphic>
+          </wp:inline>
+        </w:drawing>
+      </w:r>
+    </w:p>
+    <w:p>
+      <w:pPr>
+        <w:spacing w:before="40" w:after="280"/>
+        <w:jc w:val="center"/>
+      </w:pPr>
+      <w:r>
+        <w:rPr>
+          <w:rFonts w:ascii="Arial" w:hAnsi="Arial"/>
+          <w:i/>
+          <w:color w:val="455A64"/>
+          <w:sz w:val="18"/>
+        </w:rPr>
+        <w:t>Figure 1 -- RAAF supports three workflows: PCR-Integrated (recommended), Manual upload, and Candidate Repository Search.</w:t>
       </w:r>
     </w:p>
     <w:p>

</xml_diff>